<commit_message>
start to write literature references in diploma
</commit_message>
<xml_diff>
--- a/data/insights/1. URTA.docx
+++ b/data/insights/1. URTA.docx
@@ -859,7 +859,21 @@
           <w:b/>
           <w:bCs/>
         </w:rPr>
-        <w:t>4) Общее поле агента.</w:t>
+        <w:t xml:space="preserve">4) </w:t>
+      </w:r>
+      <w:r>
+        <w:rPr>
+          <w:b/>
+          <w:bCs/>
+        </w:rPr>
+        <w:t>Сводный блок</w:t>
+      </w:r>
+      <w:r>
+        <w:rPr>
+          <w:b/>
+          <w:bCs/>
+        </w:rPr>
+        <w:t>.</w:t>
       </w:r>
       <w:r>
         <w:br/>
@@ -1978,6 +1992,7 @@
   <w:style w:type="character" w:default="1" w:styleId="a0">
     <w:name w:val="Default Paragraph Font"/>
     <w:uiPriority w:val="1"/>
+    <w:semiHidden/>
     <w:unhideWhenUsed/>
   </w:style>
   <w:style w:type="table" w:default="1" w:styleId="a1">

</xml_diff>